<commit_message>
fix(architecture): implement all audit refactorings (v2.0.0-RELEASE)
- CRITICAL-01: Populate Quadrant 1 boundary dimension
- CRITICAL-02: Eliminate duplicate table headers across all data tables
- WARNING-03: Commit to CatBoost regressor, defer LightGBM to roadmap
- WARNING-04: Exclude ESP32/MQTT, standardize on Bluetooth HID triggers
- WARNING-05: Scope shrinkage anomaly to rule-based threshold alert (>3%)
- IMPROVEMENT-06: Remove redundant header in value taxonomy table
- IMPROVEMENT-07: Add comprehensive CapEx breakdown (485,000 BDT) and payback arithmetic
- OPT-01: Add Mermaid 3NF database schema ER diagram
- OPT-02: Implement non-blocking FEFO locking with SELECT FOR UPDATE SKIP LOCKED
- OPT-03: Specify client-generated X-Idempotency-Key format
- OPT-04: Add batch lifecycle state machine and Celery 02:00 BST quarantine sweep
</commit_message>
<xml_diff>
--- a/proposal/RetailSync_WMS_Project_Proposal.docx
+++ b/proposal/RetailSync_WMS_Project_Proposal.docx
@@ -3674,7 +3674,7 @@
                 <w:color w:val="222222"/>
                 <w:sz w:val="18"/>
               </w:rPr>
-              <w:t>Execute atomic stock deductions from retail cash registers via PostgreSQL row-level locks (SELECT ... FOR UPDATE), achieving p95 latency ≤ 800ms and p99 ≤ 1.5s with exactly zero deadlocks and zero negative balances across 10 concurrent registers.</w:t>
+              <w:t>Execute atomic stock deductions from retail cash registers via PostgreSQL row-level locks (SELECT ... FOR UPDATE SKIP LOCKED), achieving p95 latency ≤ 800ms and p99 ≤ 1.5s with exactly zero deadlocks and zero negative balances across 10 concurrent registers.</w:t>
             </w:r>
           </w:p>
         </w:tc>
@@ -3804,7 +3804,7 @@
                 <w:color w:val="222222"/>
                 <w:sz w:val="18"/>
               </w:rPr>
-              <w:t>Enforce database-level First-Expired, First-Out allocation ensuring 100% of store replenishment orders pick earliest expiring batches; automatically quarantine stock reaching ≤ 3 days to expiry, reducing spoilage to &lt; 6% in pilot simulations.</w:t>
+              <w:t>Enforce database-level First-Expired, First-Out allocation ensuring 100% of store replenishment orders pick earliest expiring batches; automatically quarantine stock reaching ≤ 3 days to expiry via scheduled daily 02:00 BST Celery sweep, reducing spoilage to &lt; 6% in pilot simulations.</w:t>
             </w:r>
           </w:p>
         </w:tc>
@@ -3934,7 +3934,7 @@
                 <w:color w:val="222222"/>
                 <w:sz w:val="18"/>
               </w:rPr>
-              <w:t>Deploy a Machine Learning Time-Series Forecasting engine (LightGBM/XGBoost) achieving MAPE ≤ 15% on high-velocity FMCG items; dynamically compute Reorder Points (ROP) using Greasley's Safety Stock with calendar festival embeddings (Ramadan, Eid).</w:t>
+              <w:t>Deploy a CatBoost Time-Series Forecasting engine with native categorical festival embeddings (Ramadan, Eid, paydays) achieving MAPE ≤ 15% on high-velocity FMCG items; dynamically compute Reorder Points (ROP) using Greasley's Safety Stock (LightGBM deferred to roadmap).</w:t>
             </w:r>
           </w:p>
         </w:tc>
@@ -4064,7 +4064,7 @@
                 <w:color w:val="222222"/>
                 <w:sz w:val="18"/>
               </w:rPr>
-              <w:t>Engineer a mobile Progressive Web Application (PWA) running on consumer Android smartphones paired with Bluetooth HID trigger grips (&lt; 4,000 BDT), achieving barcode decode-to-render latency ≤ 350ms and cutting terminal capex by 90%.</w:t>
+              <w:t>Engineer a mobile Progressive Web Application (PWA) running on consumer Android smartphones paired with Bluetooth HID trigger grips (&lt; 4,000 BDT), achieving barcode decode-to-render latency ≤ 350ms and cutting terminal capex by 90% (ESP32/MQTT cut from scope).</w:t>
             </w:r>
           </w:p>
         </w:tc>
@@ -4194,7 +4194,7 @@
                 <w:color w:val="222222"/>
                 <w:sz w:val="18"/>
               </w:rPr>
-              <w:t>Implement Service Worker background sync and encrypted IndexedDB client storage to buffer ≥ 200 sales transactions during warehouse broadband outages, replaying idempotently via Redis X-Idempotency-Key upon connection restoration.</w:t>
+              <w:t>Implement Service Worker background sync and encrypted IndexedDB client storage to buffer ≥ 200 sales transactions during warehouse broadband outages, replaying idempotently via client-generated X-Idempotency-Key ({device_id}-{epoch_ms}-{local_sequence}) upon connection restoration.</w:t>
             </w:r>
           </w:p>
         </w:tc>
@@ -4466,7 +4466,19 @@
                 <w:color w:val="FFFFFF"/>
                 <w:sz w:val="19"/>
               </w:rPr>
-              <w:t>In-Scope Modules &amp; Features</w:t>
+              <w:t>• Inbound dock receiving &amp; digital GRN generation</w:t>
+              <w:br/>
+              <w:t>• Directed spatial putaway with bin coordinate mapping</w:t>
+              <w:br/>
+              <w:t>• Real-time FEFO batch ledger with automated quarantine</w:t>
+              <w:br/>
+              <w:t>• Atomic POS concurrency deduction (sub-2.0s SLA, zero deadlocks)</w:t>
+              <w:br/>
+              <w:t>• CatBoost demand forecasting with festival calendar embeddings</w:t>
+              <w:br/>
+              <w:t>• Cycle counting with supervisor signoff and write-off approval</w:t>
+              <w:br/>
+              <w:t>• Rule-based shrinkage anomaly threshold alerts (&gt;3% variance)</w:t>
             </w:r>
           </w:p>
         </w:tc>
@@ -4492,7 +4504,11 @@
                 <w:color w:val="FFFFFF"/>
                 <w:sz w:val="19"/>
               </w:rPr>
-              <w:t>Operational / Pilot Boundaries</w:t>
+              <w:t>• 1 central distribution centre + up to 3 retail branch stores</w:t>
+              <w:br/>
+              <w:t>• SKU catalogue: 500 representative FMCG items across 4 temperature classes</w:t>
+              <w:br/>
+              <w:t>• Concurrency: 10 POS cash registers + 10 mobile warehouse scanners</w:t>
             </w:r>
           </w:p>
         </w:tc>
@@ -4518,7 +4534,13 @@
                 <w:color w:val="FFFFFF"/>
                 <w:sz w:val="19"/>
               </w:rPr>
-              <w:t>Explicit Out-of-Scope (Won't Have)</w:t>
+              <w:t>• No corporate general ledger or payroll accounting (exports CSV/JSON audit trails for external ERPs)</w:t>
+              <w:br/>
+              <w:t>• No autonomous guided vehicles (AGVs) or motorized conveyor belts</w:t>
+              <w:br/>
+              <w:t>• No direct-to-consumer delivery or rider logistics tracking</w:t>
+              <w:br/>
+              <w:t>• No integrated payment gateway (POS financial settlement is external)</w:t>
             </w:r>
           </w:p>
         </w:tc>
@@ -4573,19 +4595,19 @@
                 <w:color w:val="222222"/>
                 <w:sz w:val="18"/>
               </w:rPr>
-              <w:t>• Inbound barcode receiving &amp; digital GRN</w:t>
+              <w:t>• Inbound barcode receiving &amp; digital GRN (shelf-life threshold ≥ 65%)</w:t>
               <w:br/>
-              <w:t>• Directed spatial putaway (ABC velocity)</w:t>
+              <w:t>• Directed spatial putaway (ABC velocity &amp; temperature matching)</w:t>
               <w:br/>
-              <w:t>• Real-time FEFO batch ledger &amp; quarantine</w:t>
+              <w:t>• Real-time FEFO batch ledger &amp; quarantine Celery worker</w:t>
               <w:br/>
-              <w:t>• Sub-2.0s POS concurrency deduction</w:t>
+              <w:t>• Sub-2.0s POS concurrency deduction (SELECT ... FOR UPDATE SKIP LOCKED)</w:t>
               <w:br/>
-              <w:t>• AI Demand Forecasting &amp; Dynamic ROP DSS</w:t>
+              <w:t>• CatBoost Demand Forecasting &amp; Dynamic ROP DSS (LightGBM deferred to roadmap)</w:t>
               <w:br/>
               <w:t>• Blind cycle counting with supervisor signoff</w:t>
               <w:br/>
-              <w:t>• Isolation Forest shrinkage anomaly ML</w:t>
+              <w:t>• Rule-based shrinkage anomaly threshold alerts (&gt;3% variance; ML anomaly detection deferred to v2.0)</w:t>
             </w:r>
           </w:p>
         </w:tc>
@@ -4702,13 +4724,13 @@
               </w:rPr>
               <w:t>• Next.js 14 PWA (TypeScript, Tailwind CSS)</w:t>
               <w:br/>
-              <w:t>• FastAPI asynchronous backend (Python 3.11+)</w:t>
+              <w:t>• FastAPI asynchronous backend (Python 3.11+ ASGI)</w:t>
               <w:br/>
               <w:t>• PostgreSQL 16 (3NF ACID Relational Ledger)</w:t>
               <w:br/>
-              <w:t>• Redis 7 (Idempotency locks, session cache)</w:t>
+              <w:t>• Redis 7 (Client-generated idempotency keys, session cache)</w:t>
               <w:br/>
-              <w:t>• Celery / Redis Worker for AI inference</w:t>
+              <w:t>• Celery worker for CatBoost inference &amp; daily 02:00 BST quarantine sweeps</w:t>
               <w:br/>
               <w:t>• Docker Compose multi-container deployment</w:t>
             </w:r>
@@ -4739,9 +4761,7 @@
               <w:br/>
               <w:t>• Client: Android 13+ Chrome Mobile Browser</w:t>
               <w:br/>
-              <w:t>• Scanner: Bluetooth HID 1D/2D Barcode Trigger</w:t>
-              <w:br/>
-              <w:t>• IoT Edge: ESP32 MCU dock gate scanner (MQTT)</w:t>
+              <w:t>• Scanner: Bluetooth HID 1D/2D Barcode Trigger (&lt;4,000 BDT)</w:t>
             </w:r>
           </w:p>
         </w:tc>
@@ -4771,6 +4791,8 @@
               <w:t>• No proprietary closed-source database engines</w:t>
               <w:br/>
               <w:t>• No native iOS Swift app (PWA standard covers cross-platform access)</w:t>
+              <w:br/>
+              <w:t>• No custom IoT firmware development (ESP32/MQTT); Bluetooth HID scanning covers dock receiving</w:t>
             </w:r>
           </w:p>
         </w:tc>
@@ -4827,7 +4849,7 @@
               </w:rPr>
               <w:t>• Standard EAN-13 / Code-128 barcodes printed on packaging</w:t>
               <w:br/>
-              <w:t>• Stable local Wi-Fi / 4G coverage at central DC (with offline fallback)</w:t>
+              <w:t>• Stable local Wi-Fi / 4G coverage at central DC (with encrypted IndexedDB offline fallback)</w:t>
               <w:br/>
               <w:t>• Super shop management cooperation for pilot catalog seed data</w:t>
             </w:r>
@@ -4883,7 +4905,7 @@
               </w:rPr>
               <w:t>• Does not assume uninterrupted high-speed internet (designed offline-first)</w:t>
               <w:br/>
-              <w:t>• Does not require expensive Zebra or Honeywell handheld hardware</w:t>
+              <w:t>• Does not require expensive Zebra or Honeywell handheld hardware (uses consumer Android smartphones)</w:t>
             </w:r>
           </w:p>
         </w:tc>
@@ -10706,7 +10728,7 @@
                 <w:color w:val="222222"/>
                 <w:sz w:val="18"/>
               </w:rPr>
-              <w:t>Supplier delivers 100 crates of pasteurized milk; 10 crates carry expiration dates with only 2 days remaining (&lt; 75% shelf-life threshold).</w:t>
+              <w:t>Supplier delivers 100 crates of pasteurized milk; 10 crates carry expiration dates with only 2 days remaining (&lt; 65% shelf-life threshold).</w:t>
             </w:r>
           </w:p>
         </w:tc>
@@ -10861,7 +10883,7 @@
                 <w:color w:val="222222"/>
                 <w:sz w:val="18"/>
               </w:rPr>
-              <w:t>FastAPI POS sync endpoint executes pessimistic row lock (SELECT ... FOR UPDATE) on the earliest active batch. The first 5 requests decrement inventory atomically in &lt; 800ms. The remaining 5 requests receive immediate 'Out of Stock' response.</w:t>
+              <w:t>FastAPI POS sync endpoint executes non-blocking row lock (SELECT ... FOR UPDATE SKIP LOCKED) on the earliest active batch. The first 5 requests decrement inventory atomically in &lt; 800ms. The remaining 5 requests skip locked rows, find zero available stock, and immediately receive an 'Out of Stock' response.</w:t>
             </w:r>
           </w:p>
         </w:tc>
@@ -10991,7 +11013,7 @@
                 <w:color w:val="222222"/>
                 <w:sz w:val="18"/>
               </w:rPr>
-              <w:t>PWA Service Worker detects offline status; queues encrypted sales transactions in client IndexedDB. Upon network recovery, client automatically submits bulk sync. Backend Redis checks X-Idempotency-Key and commits all 50 sales in order.</w:t>
+              <w:t>PWA Service Worker detects offline status; queues encrypted sales transactions in client IndexedDB with client-generated X-Idempotency-Key ({device_id}-{epoch_ms}-{local_sequence}). Upon network recovery, client submits bulk sync. Backend Redis checks idempotency keys and commits all 50 sales with exactly-once semantics.</w:t>
             </w:r>
           </w:p>
         </w:tc>
@@ -11121,7 +11143,7 @@
                 <w:color w:val="222222"/>
                 <w:sz w:val="18"/>
               </w:rPr>
-              <w:t>The LightGBM time-series model identifies the upcoming Ramadan calendar embedding flag; projects 220 units/day demand; dynamically recalculates ROP and Greasley Safety Stock; triggers automated draft PO 10 days in advance.</w:t>
+              <w:t>The CatBoost time-series model identifies the upcoming Ramadan calendar embedding flag; projects 220 units/day demand; dynamically recalculates ROP and Greasley Safety Stock; triggers automated draft PO 10 days in advance (LightGBM deferred to roadmap).</w:t>
             </w:r>
           </w:p>
         </w:tc>

</xml_diff>

<commit_message>
fix(defense-sync): synchronize presentation slides, pptx, docx, and showcase with CatBoost and SKIP LOCKED
</commit_message>
<xml_diff>
--- a/proposal/RetailSync_WMS_Project_Proposal.docx
+++ b/proposal/RetailSync_WMS_Project_Proposal.docx
@@ -331,7 +331,7 @@
           <w:color w:val="222222"/>
           <w:sz w:val="20"/>
         </w:rPr>
-        <w:t>RetailSync was designed to solve this exact industry challenge. It is a centralized, high-performance Warehouse Management System (WMS) engineered specifically for the fast-paced grocery retail sector in Bangladesh. The system unifies central distribution warehouses and frontline checkout counters into a single, real-time relational core. By enforcing strict Third Normal Form (3NF) database constraints, pessimistic row-level locking on checkout deductions, directed spatial putaway, automated First-Expired, First-Out (FEFO) batch rotation, and machine-learning demand forecasting (LightGBM with festival calendar awareness), RetailSync directly tackles the three largest profit leaks in supermarket operations: (1) perishable food spoilage (15% to 22% annual loss), (2) unrecorded inventory shrinkage (1.8% to 2.4% write-offs), and (3) peak-hour stockouts during festival surges (7.5% to 11.2% lost sales).</w:t>
+        <w:t>RetailSync was designed to solve this exact industry challenge. It is a centralized, high-performance Warehouse Management System (WMS) engineered specifically for the fast-paced grocery retail sector in Bangladesh. The system unifies central distribution warehouses and frontline checkout counters into a single, real-time relational core. By enforcing strict Third Normal Form (3NF) database constraints, pessimistic row-level locking on checkout deductions, directed spatial putaway, automated First-Expired, First-Out (FEFO) batch rotation, and machine-learning demand forecasting (CatBoost with native festival calendar awareness; LightGBM deferred to roadmap), RetailSync directly tackles the three largest profit leaks in supermarket operations: (1) perishable food spoilage (15% to 22% annual loss), (2) unrecorded inventory shrinkage (1.8% to 2.4% write-offs), and (3) peak-hour stockouts during festival surges (7.5% to 11.2% lost sales).</w:t>
       </w:r>
     </w:p>
     <w:p>
@@ -881,7 +881,7 @@
                 <w:color w:val="222222"/>
                 <w:sz w:val="18"/>
               </w:rPr>
-              <w:t>Eleven modular domain services with in-depth spotlight on Module M-07 (LightGBM &amp; Greasley DSS).</w:t>
+              <w:t>Eleven modular domain services with in-depth spotlight on Module M-07 (CatBoost &amp; Greasley DSS).</w:t>
             </w:r>
           </w:p>
         </w:tc>
@@ -4270,7 +4270,7 @@
           <w:color w:val="222222"/>
           <w:sz w:val="20"/>
         </w:rPr>
-        <w:t>Execute atomic stock deductions from retail cash registers via PostgreSQL row-level locks (SELECT ... FOR UPDATE), achieving p95 latency ≤ 800ms and p99 ≤ 1.5s with zero deadlocks across 10 concurrent registers.</w:t>
+        <w:t>Execute atomic stock deductions from retail cash registers via PostgreSQL non-blocking row-level locks (SELECT ... FOR UPDATE SKIP LOCKED), achieving p95 latency ≤ 800ms and p99 ≤ 1.5s with zero deadlocks across 10 concurrent registers.</w:t>
       </w:r>
     </w:p>
     <w:p>
@@ -4316,7 +4316,7 @@
           <w:color w:val="222222"/>
           <w:sz w:val="20"/>
         </w:rPr>
-        <w:t>Deploy a Machine Learning Time-Series Forecasting engine (LightGBM/XGBoost) achieving MAPE ≤ 15% on high-velocity FMCG items; dynamically compute Reorder Points (ROP) using Greasley's Safety Stock with calendar festival embeddings (Ramadan, Eid).</w:t>
+        <w:t>Deploy a CatBoost Machine Learning Time-Series Forecasting engine achieving MAPE ≤ 15% on high-velocity FMCG items; dynamically compute Reorder Points (ROP) using Greasley's Safety Stock with native calendar festival embeddings (LightGBM deferred to roadmap).</w:t>
       </w:r>
     </w:p>
     <w:p>
@@ -4440,7 +4440,7 @@
                 <w:color w:val="FFFFFF"/>
                 <w:sz w:val="19"/>
               </w:rPr>
-              <w:t>Boundary Dimension</w:t>
+              <w:t>Scope Quadrant / Dimension</w:t>
             </w:r>
           </w:p>
         </w:tc>
@@ -4465,6 +4465,113 @@
                 <w:b/>
                 <w:color w:val="FFFFFF"/>
                 <w:sz w:val="19"/>
+              </w:rPr>
+              <w:t>In-Scope Capabilities &amp; Modules</w:t>
+            </w:r>
+          </w:p>
+        </w:tc>
+        <w:tc>
+          <w:tcPr>
+            <w:tcW w:type="dxa" w:w="2592"/>
+            <w:shd w:fill="1B365D"/>
+            <w:tcMar>
+              <w:top w:w="100" w:type="dxa"/>
+              <w:bottom w:w="100" w:type="dxa"/>
+              <w:left w:w="120" w:type="dxa"/>
+              <w:right w:w="120" w:type="dxa"/>
+            </w:tcMar>
+          </w:tcPr>
+          <w:p>
+            <w:pPr>
+              <w:spacing w:before="0" w:after="0"/>
+            </w:pPr>
+            <w:r>
+              <w:rPr>
+                <w:rFonts w:ascii="Calibri" w:hAnsi="Calibri"/>
+                <w:b/>
+                <w:color w:val="FFFFFF"/>
+                <w:sz w:val="19"/>
+              </w:rPr>
+              <w:t>Pilot Constraints &amp; Sizing</w:t>
+            </w:r>
+          </w:p>
+        </w:tc>
+        <w:tc>
+          <w:tcPr>
+            <w:tcW w:type="dxa" w:w="2736"/>
+            <w:shd w:fill="1B365D"/>
+            <w:tcMar>
+              <w:top w:w="100" w:type="dxa"/>
+              <w:bottom w:w="100" w:type="dxa"/>
+              <w:left w:w="120" w:type="dxa"/>
+              <w:right w:w="120" w:type="dxa"/>
+            </w:tcMar>
+          </w:tcPr>
+          <w:p>
+            <w:pPr>
+              <w:spacing w:before="0" w:after="0"/>
+            </w:pPr>
+            <w:r>
+              <w:rPr>
+                <w:rFonts w:ascii="Calibri" w:hAnsi="Calibri"/>
+                <w:b/>
+                <w:color w:val="FFFFFF"/>
+                <w:sz w:val="19"/>
+              </w:rPr>
+              <w:t>Explicitly Out of Scope</w:t>
+            </w:r>
+          </w:p>
+        </w:tc>
+      </w:tr>
+      <w:tr>
+        <w:trPr>
+          <w:cantSplit/>
+        </w:trPr>
+        <w:tc>
+          <w:tcPr>
+            <w:tcW w:type="dxa" w:w="1872"/>
+            <w:shd w:fill="FFFFFF"/>
+            <w:tcMar>
+              <w:top w:w="60" w:type="dxa"/>
+              <w:bottom w:w="60" w:type="dxa"/>
+              <w:left w:w="100" w:type="dxa"/>
+              <w:right w:w="100" w:type="dxa"/>
+            </w:tcMar>
+          </w:tcPr>
+          <w:p>
+            <w:pPr>
+              <w:spacing w:before="0" w:after="0" w:line="276" w:lineRule="auto"/>
+            </w:pPr>
+            <w:r>
+              <w:rPr>
+                <w:rFonts w:ascii="Calibri" w:hAnsi="Calibri"/>
+                <w:color w:val="222222"/>
+                <w:sz w:val="18"/>
+              </w:rPr>
+              <w:t>Boundary Dimension</w:t>
+            </w:r>
+          </w:p>
+        </w:tc>
+        <w:tc>
+          <w:tcPr>
+            <w:tcW w:type="dxa" w:w="2592"/>
+            <w:shd w:fill="FFFFFF"/>
+            <w:tcMar>
+              <w:top w:w="60" w:type="dxa"/>
+              <w:bottom w:w="60" w:type="dxa"/>
+              <w:left w:w="100" w:type="dxa"/>
+              <w:right w:w="100" w:type="dxa"/>
+            </w:tcMar>
+          </w:tcPr>
+          <w:p>
+            <w:pPr>
+              <w:spacing w:before="0" w:after="0" w:line="276" w:lineRule="auto"/>
+            </w:pPr>
+            <w:r>
+              <w:rPr>
+                <w:rFonts w:ascii="Calibri" w:hAnsi="Calibri"/>
+                <w:color w:val="222222"/>
+                <w:sz w:val="18"/>
               </w:rPr>
               <w:t>• Inbound dock receiving &amp; digital GRN generation</w:t>
               <w:br/>
@@ -4485,24 +4592,23 @@
         <w:tc>
           <w:tcPr>
             <w:tcW w:type="dxa" w:w="2592"/>
-            <w:shd w:fill="1B365D"/>
-            <w:tcMar>
-              <w:top w:w="100" w:type="dxa"/>
-              <w:bottom w:w="100" w:type="dxa"/>
-              <w:left w:w="120" w:type="dxa"/>
-              <w:right w:w="120" w:type="dxa"/>
-            </w:tcMar>
-          </w:tcPr>
-          <w:p>
-            <w:pPr>
-              <w:spacing w:before="0" w:after="0"/>
-            </w:pPr>
-            <w:r>
-              <w:rPr>
-                <w:rFonts w:ascii="Calibri" w:hAnsi="Calibri"/>
-                <w:b/>
-                <w:color w:val="FFFFFF"/>
-                <w:sz w:val="19"/>
+            <w:shd w:fill="FFFFFF"/>
+            <w:tcMar>
+              <w:top w:w="60" w:type="dxa"/>
+              <w:bottom w:w="60" w:type="dxa"/>
+              <w:left w:w="100" w:type="dxa"/>
+              <w:right w:w="100" w:type="dxa"/>
+            </w:tcMar>
+          </w:tcPr>
+          <w:p>
+            <w:pPr>
+              <w:spacing w:before="0" w:after="0" w:line="276" w:lineRule="auto"/>
+            </w:pPr>
+            <w:r>
+              <w:rPr>
+                <w:rFonts w:ascii="Calibri" w:hAnsi="Calibri"/>
+                <w:color w:val="222222"/>
+                <w:sz w:val="18"/>
               </w:rPr>
               <w:t>• 1 central distribution centre + up to 3 retail branch stores</w:t>
               <w:br/>
@@ -4515,24 +4621,23 @@
         <w:tc>
           <w:tcPr>
             <w:tcW w:type="dxa" w:w="2736"/>
-            <w:shd w:fill="1B365D"/>
-            <w:tcMar>
-              <w:top w:w="100" w:type="dxa"/>
-              <w:bottom w:w="100" w:type="dxa"/>
-              <w:left w:w="120" w:type="dxa"/>
-              <w:right w:w="120" w:type="dxa"/>
-            </w:tcMar>
-          </w:tcPr>
-          <w:p>
-            <w:pPr>
-              <w:spacing w:before="0" w:after="0"/>
-            </w:pPr>
-            <w:r>
-              <w:rPr>
-                <w:rFonts w:ascii="Calibri" w:hAnsi="Calibri"/>
-                <w:b/>
-                <w:color w:val="FFFFFF"/>
-                <w:sz w:val="19"/>
+            <w:shd w:fill="FFFFFF"/>
+            <w:tcMar>
+              <w:top w:w="60" w:type="dxa"/>
+              <w:bottom w:w="60" w:type="dxa"/>
+              <w:left w:w="100" w:type="dxa"/>
+              <w:right w:w="100" w:type="dxa"/>
+            </w:tcMar>
+          </w:tcPr>
+          <w:p>
+            <w:pPr>
+              <w:spacing w:before="0" w:after="0" w:line="276" w:lineRule="auto"/>
+            </w:pPr>
+            <w:r>
+              <w:rPr>
+                <w:rFonts w:ascii="Calibri" w:hAnsi="Calibri"/>
+                <w:color w:val="222222"/>
+                <w:sz w:val="18"/>
               </w:rPr>
               <w:t>• No corporate general ledger or payroll accounting (exports CSV/JSON audit trails for external ERPs)</w:t>
               <w:br/>
@@ -4552,7 +4657,7 @@
         <w:tc>
           <w:tcPr>
             <w:tcW w:type="dxa" w:w="1872"/>
-            <w:shd w:fill="FFFFFF"/>
+            <w:shd w:fill="F8FAFC"/>
             <w:tcMar>
               <w:top w:w="60" w:type="dxa"/>
               <w:bottom w:w="60" w:type="dxa"/>
@@ -4577,7 +4682,7 @@
         <w:tc>
           <w:tcPr>
             <w:tcW w:type="dxa" w:w="2592"/>
-            <w:shd w:fill="FFFFFF"/>
+            <w:shd w:fill="F8FAFC"/>
             <w:tcMar>
               <w:top w:w="60" w:type="dxa"/>
               <w:bottom w:w="60" w:type="dxa"/>
@@ -4614,7 +4719,7 @@
         <w:tc>
           <w:tcPr>
             <w:tcW w:type="dxa" w:w="2592"/>
-            <w:shd w:fill="FFFFFF"/>
+            <w:shd w:fill="F8FAFC"/>
             <w:tcMar>
               <w:top w:w="60" w:type="dxa"/>
               <w:bottom w:w="60" w:type="dxa"/>
@@ -4643,7 +4748,7 @@
         <w:tc>
           <w:tcPr>
             <w:tcW w:type="dxa" w:w="2736"/>
-            <w:shd w:fill="FFFFFF"/>
+            <w:shd w:fill="F8FAFC"/>
             <w:tcMar>
               <w:top w:w="60" w:type="dxa"/>
               <w:bottom w:w="60" w:type="dxa"/>
@@ -4679,7 +4784,7 @@
         <w:tc>
           <w:tcPr>
             <w:tcW w:type="dxa" w:w="1872"/>
-            <w:shd w:fill="F8FAFC"/>
+            <w:shd w:fill="FFFFFF"/>
             <w:tcMar>
               <w:top w:w="60" w:type="dxa"/>
               <w:bottom w:w="60" w:type="dxa"/>
@@ -4704,7 +4809,7 @@
         <w:tc>
           <w:tcPr>
             <w:tcW w:type="dxa" w:w="2592"/>
-            <w:shd w:fill="F8FAFC"/>
+            <w:shd w:fill="FFFFFF"/>
             <w:tcMar>
               <w:top w:w="60" w:type="dxa"/>
               <w:bottom w:w="60" w:type="dxa"/>
@@ -4739,7 +4844,7 @@
         <w:tc>
           <w:tcPr>
             <w:tcW w:type="dxa" w:w="2592"/>
-            <w:shd w:fill="F8FAFC"/>
+            <w:shd w:fill="FFFFFF"/>
             <w:tcMar>
               <w:top w:w="60" w:type="dxa"/>
               <w:bottom w:w="60" w:type="dxa"/>
@@ -4768,7 +4873,7 @@
         <w:tc>
           <w:tcPr>
             <w:tcW w:type="dxa" w:w="2736"/>
-            <w:shd w:fill="F8FAFC"/>
+            <w:shd w:fill="FFFFFF"/>
             <w:tcMar>
               <w:top w:w="60" w:type="dxa"/>
               <w:bottom w:w="60" w:type="dxa"/>
@@ -4804,7 +4909,7 @@
         <w:tc>
           <w:tcPr>
             <w:tcW w:type="dxa" w:w="1872"/>
-            <w:shd w:fill="FFFFFF"/>
+            <w:shd w:fill="F8FAFC"/>
             <w:tcMar>
               <w:top w:w="60" w:type="dxa"/>
               <w:bottom w:w="60" w:type="dxa"/>
@@ -4829,7 +4934,7 @@
         <w:tc>
           <w:tcPr>
             <w:tcW w:type="dxa" w:w="2592"/>
-            <w:shd w:fill="FFFFFF"/>
+            <w:shd w:fill="F8FAFC"/>
             <w:tcMar>
               <w:top w:w="60" w:type="dxa"/>
               <w:bottom w:w="60" w:type="dxa"/>
@@ -4858,7 +4963,7 @@
         <w:tc>
           <w:tcPr>
             <w:tcW w:type="dxa" w:w="2592"/>
-            <w:shd w:fill="FFFFFF"/>
+            <w:shd w:fill="F8FAFC"/>
             <w:tcMar>
               <w:top w:w="60" w:type="dxa"/>
               <w:bottom w:w="60" w:type="dxa"/>
@@ -4885,7 +4990,7 @@
         <w:tc>
           <w:tcPr>
             <w:tcW w:type="dxa" w:w="2736"/>
-            <w:shd w:fill="FFFFFF"/>
+            <w:shd w:fill="F8FAFC"/>
             <w:tcMar>
               <w:top w:w="60" w:type="dxa"/>
               <w:bottom w:w="60" w:type="dxa"/>
@@ -5463,7 +5568,7 @@
           <w:color w:val="222222"/>
           <w:sz w:val="20"/>
         </w:rPr>
-        <w:t>When a retail customer purchases an item at the frontline checkout register, the POS sends an atomic deduction request to the API. The system executes a pessimistic row lock (`SELECT ... FOR UPDATE`) on the earliest active batch, deducting stock in &lt; 2.0 seconds with zero overselling.</w:t>
+        <w:t>When a retail customer purchases an item at the frontline checkout register, the POS sends an atomic deduction request to the API. The system executes a non-blocking row lock (`SELECT ... FOR UPDATE SKIP LOCKED`) on the earliest active batch, deducting stock in &lt; 2.0 seconds with zero overselling.</w:t>
       </w:r>
     </w:p>
     <w:p>
@@ -5747,7 +5852,7 @@
           <w:color w:val="222222"/>
           <w:sz w:val="20"/>
         </w:rPr>
-        <w:t>Integrates supervised machine learning (LightGBM/XGBoost) with classical inventory science. Predicts 7-day and 14-day rolling SKU demand utilizing calendar festival embeddings (Ramadan, Eid-ul-Fitr, Eid-ul-Adha, payday spikes). Feeds predicted demand into Greasley's Statistical Safety Stock to dynamically adjust Reorder Points (ROP) before stockouts occur.</w:t>
+        <w:t>Integrates supervised machine learning (CatBoost regressor; LightGBM deferred to roadmap) with classical inventory science. Predicts 7-day and 14-day rolling SKU demand utilizing calendar festival embeddings (Ramadan, Eid-ul-Fitr, Eid-ul-Adha, payday spikes). Feeds predicted demand into Greasley's Statistical Safety Stock to dynamically adjust Reorder Points (ROP) before stockouts occur.</w:t>
       </w:r>
     </w:p>
     <w:p>
@@ -5783,7 +5888,7 @@
           <w:color w:val="222222"/>
           <w:sz w:val="20"/>
         </w:rPr>
-        <w:t xml:space="preserve">M-09: Blind Cycle Counting &amp; Shrinkage ML: </w:t>
+        <w:t xml:space="preserve">M-09: Blind Cycle Counting &amp; Shrinkage Anomaly Alert: </w:t>
       </w:r>
       <w:r>
         <w:rPr>
@@ -5791,7 +5896,7 @@
           <w:color w:val="222222"/>
           <w:sz w:val="20"/>
         </w:rPr>
-        <w:t>Generates daily ABC-classified cycle counting task sheets where expected system quantities are hidden from floor workers to prevent confirmation bias. Integrates an unsupervised Scikit-learn Isolation Forest model to detect pilferage and anomalous loss clusters.</w:t>
+        <w:t>Generates daily ABC-classified cycle counting task sheets where expected system quantities are hidden from floor workers to prevent confirmation bias. Integrates an empirical rule-based shrinkage anomaly threshold alert (&gt;3% variance) to flag pilferage and anomalous loss clusters; ML anomaly detection deferred to v2.0.</w:t>
       </w:r>
     </w:p>
     <w:tbl>
@@ -5847,7 +5952,7 @@
                 <w:color w:val="222222"/>
                 <w:sz w:val="19"/>
               </w:rPr>
-              <w:t>1. Supervised Machine Learning Demand Predictor: d_hat_{t+L} = f_LightGBM(X_features)  [X incorporates 7-day lags, rolling statistics, calendar flags for Ramadan/Eid, and payday cycles]</w:t>
+              <w:t>1. Supervised Machine Learning Demand Predictor: d_hat_{t+L} = f_CatBoost(X_features)  [X incorporates 7-day lags, rolling statistics, native categorical flags for Ramadan/Eid, and payday cycles; LightGBM deferred to roadmap]</w:t>
             </w:r>
           </w:p>
           <w:p>
@@ -7689,7 +7794,7 @@
           <w:color w:val="222222"/>
           <w:sz w:val="20"/>
         </w:rPr>
-        <w:t>Reverse proxy (Nginx) terminating TLS 1.3 encryption, managing rate limiting, CORS policies, and local edge routing. For stationary dock gates, an ESP32 microcontroller with RFID/fixed barcode readers communicates over MQTT with TLS.</w:t>
+        <w:t>Reverse proxy (Nginx) terminating TLS 1.3 encryption, managing rate limiting, CORS policies, and local edge routing. Dock receiving is standardized on wireless Bluetooth HID trigger grips paired with Android PWAs, cutting custom ESP32/MQTT firmware overhead.</w:t>
       </w:r>
     </w:p>
     <w:p>
@@ -7711,7 +7816,7 @@
           <w:color w:val="222222"/>
           <w:sz w:val="20"/>
         </w:rPr>
-        <w:t>Stateless, asynchronous REST API powered by Python 3.11+ and FastAPI. Paired with background Celery workers executing LightGBM demand forecasting and Isolation Forest shrinkage anomaly models.</w:t>
+        <w:t>Stateless, asynchronous REST API powered by Python 3.11+ and FastAPI. Paired with background Celery workers executing CatBoost demand forecasting and scheduled daily 02:00 BST quarantine sweeps.</w:t>
       </w:r>
     </w:p>
     <w:p>
@@ -7831,7 +7936,7 @@
           <w:color w:val="222222"/>
           <w:sz w:val="20"/>
         </w:rPr>
-        <w:t>When an `/api/v1/pos/sync` deduction transaction begins, the database queries `product_batches` using `SELECT id, current_qty FROM product_batches WHERE product_id = :p_id AND current_qty &gt; 0 ORDER BY expiry_date ASC LIMIT 1 FOR UPDATE`. This locks exclusively that specific batch record. Subsequent concurrent POS requests for the same batch queue safely for milliseconds without deadlocking or reading stale stock balances. Once the deduction is written to the ledger, the lock releases, guaranteeing absolute ACID consistency.</w:t>
+        <w:t>When an `/api/v1/pos/sync` deduction transaction begins, the database queries `product_batches` using `SELECT id, current_qty FROM product_batches WHERE product_id = :p_id AND current_qty &gt; 0 ORDER BY expiry_date ASC LIMIT 1 FOR UPDATE SKIP LOCKED`. This locks exclusively that specific batch record without blocking parallel sales on adjacent batches. Subsequent concurrent POS requests for the same batch queue safely for milliseconds without deadlocking or reading stale stock balances. Once the deduction is written to the ledger, the lock releases, guaranteeing absolute ACID consistency.</w:t>
       </w:r>
     </w:p>
     <w:p>
@@ -9602,7 +9707,7 @@
           <w:color w:val="222222"/>
           <w:sz w:val="20"/>
         </w:rPr>
-        <w:t>Redis provides sub-millisecond validation of `X-Idempotency-Key` headers on POS sync endpoints, preventing duplicate sales deductions during network retries while caching active user sessions.</w:t>
+        <w:t>Redis provides sub-millisecond validation of client-generated `X-Idempotency-Key` headers ({device_id}-{epoch_ms}-{local_sequence}) on POS sync endpoints, preventing duplicate sales deductions during network retries while caching active user sessions.</w:t>
       </w:r>
     </w:p>
     <w:p>
@@ -9616,7 +9721,7 @@
           <w:color w:val="222222"/>
           <w:sz w:val="20"/>
         </w:rPr>
-        <w:t xml:space="preserve">ADR-05: LightGBM for Tabular Time-Series Forecasting: </w:t>
+        <w:t xml:space="preserve">ADR-05: CatBoost for Tabular Time-Series Forecasting: </w:t>
       </w:r>
       <w:r>
         <w:rPr>
@@ -9624,7 +9729,7 @@
           <w:color w:val="222222"/>
           <w:sz w:val="20"/>
         </w:rPr>
-        <w:t>LightGBM provides sub-50ms inference times on tabular retail sales data, handles categorical calendar embeddings (Ramadan/Eid) natively, and delivers higher accuracy with lower compute overhead than heavy recurrent neural networks on edge servers.</w:t>
+        <w:t>CatBoost provides native categorical handling of festival calendar flags (Ramadan/Eid) without target leakage or manual encoding overhead, delivering sub-50ms inference times. LightGBM is formally deferred to the post-capstone v2.0 benchmark roadmap.</w:t>
       </w:r>
     </w:p>
     <w:p>
@@ -17081,6 +17186,638 @@
     </w:tbl>
     <w:p>
       <w:pPr>
+        <w:spacing w:before="0" w:after="80" w:line="276" w:lineRule="auto"/>
+      </w:pPr>
+      <w:r>
+        <w:rPr>
+          <w:rFonts w:ascii="Calibri" w:hAnsi="Calibri"/>
+          <w:color w:val="222222"/>
+          <w:sz w:val="20"/>
+        </w:rPr>
+        <w:t>To establish rigorous financial feasibility, the complete Initial Capital Expenditure (CapEx) for 14-week engineering delivery, pilot staging, and hardware deployment is itemized below:</w:t>
+      </w:r>
+    </w:p>
+    <w:tbl>
+      <w:tblPr>
+        <w:tblW w:type="auto" w:w="0"/>
+        <w:jc w:val="center"/>
+        <w:tblLook w:firstColumn="1" w:firstRow="1" w:lastColumn="0" w:lastRow="0" w:noHBand="0" w:noVBand="1" w:val="04A0"/>
+        <w:tblBorders>
+          <w:top w:val="single" w:sz="6" w:space="0" w:color="CBD5E1"/>
+          <w:bottom w:val="single" w:sz="8" w:space="0" w:color="CBD5E1"/>
+          <w:left w:val="none"/>
+          <w:right w:val="none"/>
+          <w:insideH w:val="single" w:sz="4" w:space="0" w:color="CBD5E1"/>
+          <w:insideV w:val="none"/>
+        </w:tblBorders>
+      </w:tblPr>
+      <w:tblGrid>
+        <w:gridCol w:w="3264"/>
+        <w:gridCol w:w="3264"/>
+        <w:gridCol w:w="3264"/>
+      </w:tblGrid>
+      <w:tr>
+        <w:trPr>
+          <w:tblHeader/>
+          <w:cantSplit/>
+        </w:trPr>
+        <w:tc>
+          <w:tcPr>
+            <w:tcW w:type="dxa" w:w="2880"/>
+            <w:shd w:fill="1B365D"/>
+            <w:tcMar>
+              <w:top w:w="100" w:type="dxa"/>
+              <w:bottom w:w="100" w:type="dxa"/>
+              <w:left w:w="120" w:type="dxa"/>
+              <w:right w:w="120" w:type="dxa"/>
+            </w:tcMar>
+          </w:tcPr>
+          <w:p>
+            <w:pPr>
+              <w:spacing w:before="0" w:after="0"/>
+            </w:pPr>
+            <w:r>
+              <w:rPr>
+                <w:rFonts w:ascii="Calibri" w:hAnsi="Calibri"/>
+                <w:b/>
+                <w:color w:val="FFFFFF"/>
+                <w:sz w:val="19"/>
+              </w:rPr>
+              <w:t>Cost Category</w:t>
+            </w:r>
+          </w:p>
+        </w:tc>
+        <w:tc>
+          <w:tcPr>
+            <w:tcW w:type="dxa" w:w="1872"/>
+            <w:shd w:fill="1B365D"/>
+            <w:tcMar>
+              <w:top w:w="100" w:type="dxa"/>
+              <w:bottom w:w="100" w:type="dxa"/>
+              <w:left w:w="120" w:type="dxa"/>
+              <w:right w:w="120" w:type="dxa"/>
+            </w:tcMar>
+          </w:tcPr>
+          <w:p>
+            <w:pPr>
+              <w:spacing w:before="0" w:after="0"/>
+            </w:pPr>
+            <w:r>
+              <w:rPr>
+                <w:rFonts w:ascii="Calibri" w:hAnsi="Calibri"/>
+                <w:b/>
+                <w:color w:val="FFFFFF"/>
+                <w:sz w:val="19"/>
+              </w:rPr>
+              <w:t>Amount (BDT)</w:t>
+            </w:r>
+          </w:p>
+        </w:tc>
+        <w:tc>
+          <w:tcPr>
+            <w:tcW w:type="dxa" w:w="5040"/>
+            <w:shd w:fill="1B365D"/>
+            <w:tcMar>
+              <w:top w:w="100" w:type="dxa"/>
+              <w:bottom w:w="100" w:type="dxa"/>
+              <w:left w:w="120" w:type="dxa"/>
+              <w:right w:w="120" w:type="dxa"/>
+            </w:tcMar>
+          </w:tcPr>
+          <w:p>
+            <w:pPr>
+              <w:spacing w:before="0" w:after="0"/>
+            </w:pPr>
+            <w:r>
+              <w:rPr>
+                <w:rFonts w:ascii="Calibri" w:hAnsi="Calibri"/>
+                <w:b/>
+                <w:color w:val="FFFFFF"/>
+                <w:sz w:val="19"/>
+              </w:rPr>
+              <w:t>Description &amp; Justification</w:t>
+            </w:r>
+          </w:p>
+        </w:tc>
+      </w:tr>
+      <w:tr>
+        <w:trPr>
+          <w:cantSplit/>
+        </w:trPr>
+        <w:tc>
+          <w:tcPr>
+            <w:tcW w:type="dxa" w:w="2880"/>
+            <w:shd w:fill="FFFFFF"/>
+            <w:tcMar>
+              <w:top w:w="60" w:type="dxa"/>
+              <w:bottom w:w="60" w:type="dxa"/>
+              <w:left w:w="100" w:type="dxa"/>
+              <w:right w:w="100" w:type="dxa"/>
+            </w:tcMar>
+          </w:tcPr>
+          <w:p>
+            <w:pPr>
+              <w:spacing w:before="0" w:after="0" w:line="276" w:lineRule="auto"/>
+            </w:pPr>
+            <w:r>
+              <w:rPr>
+                <w:rFonts w:ascii="Calibri" w:hAnsi="Calibri"/>
+                <w:color w:val="222222"/>
+                <w:sz w:val="18"/>
+              </w:rPr>
+              <w:t>Hardware Terminals &amp; Peripherals</w:t>
+            </w:r>
+          </w:p>
+        </w:tc>
+        <w:tc>
+          <w:tcPr>
+            <w:tcW w:type="dxa" w:w="1872"/>
+            <w:shd w:fill="FFFFFF"/>
+            <w:tcMar>
+              <w:top w:w="60" w:type="dxa"/>
+              <w:bottom w:w="60" w:type="dxa"/>
+              <w:left w:w="100" w:type="dxa"/>
+              <w:right w:w="100" w:type="dxa"/>
+            </w:tcMar>
+          </w:tcPr>
+          <w:p>
+            <w:pPr>
+              <w:spacing w:before="0" w:after="0" w:line="276" w:lineRule="auto"/>
+            </w:pPr>
+            <w:r>
+              <w:rPr>
+                <w:rFonts w:ascii="Calibri" w:hAnsi="Calibri"/>
+                <w:color w:val="222222"/>
+                <w:sz w:val="18"/>
+              </w:rPr>
+              <w:t>34,050</w:t>
+            </w:r>
+          </w:p>
+        </w:tc>
+        <w:tc>
+          <w:tcPr>
+            <w:tcW w:type="dxa" w:w="5040"/>
+            <w:shd w:fill="FFFFFF"/>
+            <w:tcMar>
+              <w:top w:w="60" w:type="dxa"/>
+              <w:bottom w:w="60" w:type="dxa"/>
+              <w:left w:w="100" w:type="dxa"/>
+              <w:right w:w="100" w:type="dxa"/>
+            </w:tcMar>
+          </w:tcPr>
+          <w:p>
+            <w:pPr>
+              <w:spacing w:before="0" w:after="0" w:line="276" w:lineRule="auto"/>
+            </w:pPr>
+            <w:r>
+              <w:rPr>
+                <w:rFonts w:ascii="Calibri" w:hAnsi="Calibri"/>
+                <w:color w:val="222222"/>
+                <w:sz w:val="18"/>
+              </w:rPr>
+              <w:t>Android smartphone (12,500), 2x Bluetooth trigger grips (7,600), thermal printer (6,500), adhesive barcode labels (1,950), 6-month staging VPS (5,500).</w:t>
+            </w:r>
+          </w:p>
+        </w:tc>
+      </w:tr>
+      <w:tr>
+        <w:trPr>
+          <w:cantSplit/>
+        </w:trPr>
+        <w:tc>
+          <w:tcPr>
+            <w:tcW w:type="dxa" w:w="2880"/>
+            <w:shd w:fill="F8FAFC"/>
+            <w:tcMar>
+              <w:top w:w="60" w:type="dxa"/>
+              <w:bottom w:w="60" w:type="dxa"/>
+              <w:left w:w="100" w:type="dxa"/>
+              <w:right w:w="100" w:type="dxa"/>
+            </w:tcMar>
+          </w:tcPr>
+          <w:p>
+            <w:pPr>
+              <w:spacing w:before="0" w:after="0" w:line="276" w:lineRule="auto"/>
+            </w:pPr>
+            <w:r>
+              <w:rPr>
+                <w:rFonts w:ascii="Calibri" w:hAnsi="Calibri"/>
+                <w:color w:val="222222"/>
+                <w:sz w:val="18"/>
+              </w:rPr>
+              <w:t>Development &amp; Engineering Labour</w:t>
+            </w:r>
+          </w:p>
+        </w:tc>
+        <w:tc>
+          <w:tcPr>
+            <w:tcW w:type="dxa" w:w="1872"/>
+            <w:shd w:fill="F8FAFC"/>
+            <w:tcMar>
+              <w:top w:w="60" w:type="dxa"/>
+              <w:bottom w:w="60" w:type="dxa"/>
+              <w:left w:w="100" w:type="dxa"/>
+              <w:right w:w="100" w:type="dxa"/>
+            </w:tcMar>
+          </w:tcPr>
+          <w:p>
+            <w:pPr>
+              <w:spacing w:before="0" w:after="0" w:line="276" w:lineRule="auto"/>
+            </w:pPr>
+            <w:r>
+              <w:rPr>
+                <w:rFonts w:ascii="Calibri" w:hAnsi="Calibri"/>
+                <w:color w:val="222222"/>
+                <w:sz w:val="18"/>
+              </w:rPr>
+              <w:t>420,000</w:t>
+            </w:r>
+          </w:p>
+        </w:tc>
+        <w:tc>
+          <w:tcPr>
+            <w:tcW w:type="dxa" w:w="5040"/>
+            <w:shd w:fill="F8FAFC"/>
+            <w:tcMar>
+              <w:top w:w="60" w:type="dxa"/>
+              <w:bottom w:w="60" w:type="dxa"/>
+              <w:left w:w="100" w:type="dxa"/>
+              <w:right w:w="100" w:type="dxa"/>
+            </w:tcMar>
+          </w:tcPr>
+          <w:p>
+            <w:pPr>
+              <w:spacing w:before="0" w:after="0" w:line="276" w:lineRule="auto"/>
+            </w:pPr>
+            <w:r>
+              <w:rPr>
+                <w:rFonts w:ascii="Calibri" w:hAnsi="Calibri"/>
+                <w:color w:val="222222"/>
+                <w:sz w:val="18"/>
+              </w:rPr>
+              <w:t>3-member engineering team × 14 weeks × standard software engineering stipend rate (~10,000 BDT/week/member).</w:t>
+            </w:r>
+          </w:p>
+        </w:tc>
+      </w:tr>
+      <w:tr>
+        <w:trPr>
+          <w:cantSplit/>
+        </w:trPr>
+        <w:tc>
+          <w:tcPr>
+            <w:tcW w:type="dxa" w:w="2880"/>
+            <w:shd w:fill="FFFFFF"/>
+            <w:tcMar>
+              <w:top w:w="60" w:type="dxa"/>
+              <w:bottom w:w="60" w:type="dxa"/>
+              <w:left w:w="100" w:type="dxa"/>
+              <w:right w:w="100" w:type="dxa"/>
+            </w:tcMar>
+          </w:tcPr>
+          <w:p>
+            <w:pPr>
+              <w:spacing w:before="0" w:after="0" w:line="276" w:lineRule="auto"/>
+            </w:pPr>
+            <w:r>
+              <w:rPr>
+                <w:rFonts w:ascii="Calibri" w:hAnsi="Calibri"/>
+                <w:color w:val="222222"/>
+                <w:sz w:val="18"/>
+              </w:rPr>
+              <w:t>Contingency Reserve (5%)</w:t>
+            </w:r>
+          </w:p>
+        </w:tc>
+        <w:tc>
+          <w:tcPr>
+            <w:tcW w:type="dxa" w:w="1872"/>
+            <w:shd w:fill="FFFFFF"/>
+            <w:tcMar>
+              <w:top w:w="60" w:type="dxa"/>
+              <w:bottom w:w="60" w:type="dxa"/>
+              <w:left w:w="100" w:type="dxa"/>
+              <w:right w:w="100" w:type="dxa"/>
+            </w:tcMar>
+          </w:tcPr>
+          <w:p>
+            <w:pPr>
+              <w:spacing w:before="0" w:after="0" w:line="276" w:lineRule="auto"/>
+            </w:pPr>
+            <w:r>
+              <w:rPr>
+                <w:rFonts w:ascii="Calibri" w:hAnsi="Calibri"/>
+                <w:color w:val="222222"/>
+                <w:sz w:val="18"/>
+              </w:rPr>
+              <w:t>22,700</w:t>
+            </w:r>
+          </w:p>
+        </w:tc>
+        <w:tc>
+          <w:tcPr>
+            <w:tcW w:type="dxa" w:w="5040"/>
+            <w:shd w:fill="FFFFFF"/>
+            <w:tcMar>
+              <w:top w:w="60" w:type="dxa"/>
+              <w:bottom w:w="60" w:type="dxa"/>
+              <w:left w:w="100" w:type="dxa"/>
+              <w:right w:w="100" w:type="dxa"/>
+            </w:tcMar>
+          </w:tcPr>
+          <w:p>
+            <w:pPr>
+              <w:spacing w:before="0" w:after="0" w:line="276" w:lineRule="auto"/>
+            </w:pPr>
+            <w:r>
+              <w:rPr>
+                <w:rFonts w:ascii="Calibri" w:hAnsi="Calibri"/>
+                <w:color w:val="222222"/>
+                <w:sz w:val="18"/>
+              </w:rPr>
+              <w:t>Dedicated contingency buffer for hardware replacement, mobile data packs, and peripheral spares during pilot operations.</w:t>
+            </w:r>
+          </w:p>
+        </w:tc>
+      </w:tr>
+      <w:tr>
+        <w:trPr>
+          <w:cantSplit/>
+        </w:trPr>
+        <w:tc>
+          <w:tcPr>
+            <w:tcW w:type="dxa" w:w="2880"/>
+            <w:shd w:fill="F8FAFC"/>
+            <w:tcMar>
+              <w:top w:w="60" w:type="dxa"/>
+              <w:bottom w:w="60" w:type="dxa"/>
+              <w:left w:w="100" w:type="dxa"/>
+              <w:right w:w="100" w:type="dxa"/>
+            </w:tcMar>
+          </w:tcPr>
+          <w:p>
+            <w:pPr>
+              <w:spacing w:before="0" w:after="0" w:line="276" w:lineRule="auto"/>
+            </w:pPr>
+            <w:r>
+              <w:rPr>
+                <w:rFonts w:ascii="Calibri" w:hAnsi="Calibri"/>
+                <w:color w:val="222222"/>
+                <w:sz w:val="18"/>
+              </w:rPr>
+              <w:t>Regulatory &amp; Compliance Documentation</w:t>
+            </w:r>
+          </w:p>
+        </w:tc>
+        <w:tc>
+          <w:tcPr>
+            <w:tcW w:type="dxa" w:w="1872"/>
+            <w:shd w:fill="F8FAFC"/>
+            <w:tcMar>
+              <w:top w:w="60" w:type="dxa"/>
+              <w:bottom w:w="60" w:type="dxa"/>
+              <w:left w:w="100" w:type="dxa"/>
+              <w:right w:w="100" w:type="dxa"/>
+            </w:tcMar>
+          </w:tcPr>
+          <w:p>
+            <w:pPr>
+              <w:spacing w:before="0" w:after="0" w:line="276" w:lineRule="auto"/>
+            </w:pPr>
+            <w:r>
+              <w:rPr>
+                <w:rFonts w:ascii="Calibri" w:hAnsi="Calibri"/>
+                <w:color w:val="222222"/>
+                <w:sz w:val="18"/>
+              </w:rPr>
+              <w:t>8,250</w:t>
+            </w:r>
+          </w:p>
+        </w:tc>
+        <w:tc>
+          <w:tcPr>
+            <w:tcW w:type="dxa" w:w="5040"/>
+            <w:shd w:fill="F8FAFC"/>
+            <w:tcMar>
+              <w:top w:w="60" w:type="dxa"/>
+              <w:bottom w:w="60" w:type="dxa"/>
+              <w:left w:w="100" w:type="dxa"/>
+              <w:right w:w="100" w:type="dxa"/>
+            </w:tcMar>
+          </w:tcPr>
+          <w:p>
+            <w:pPr>
+              <w:spacing w:before="0" w:after="0" w:line="276" w:lineRule="auto"/>
+            </w:pPr>
+            <w:r>
+              <w:rPr>
+                <w:rFonts w:ascii="Calibri" w:hAnsi="Calibri"/>
+                <w:color w:val="222222"/>
+                <w:sz w:val="18"/>
+              </w:rPr>
+              <w:t>BSTI/BFSA audit documentation, printed pilot manuals, thermal roll refills, and domain/SSL certificates.</w:t>
+            </w:r>
+          </w:p>
+        </w:tc>
+      </w:tr>
+      <w:tr>
+        <w:trPr>
+          <w:cantSplit/>
+        </w:trPr>
+        <w:tc>
+          <w:tcPr>
+            <w:tcW w:type="dxa" w:w="2880"/>
+            <w:shd w:fill="FFFFFF"/>
+            <w:tcMar>
+              <w:top w:w="60" w:type="dxa"/>
+              <w:bottom w:w="60" w:type="dxa"/>
+              <w:left w:w="100" w:type="dxa"/>
+              <w:right w:w="100" w:type="dxa"/>
+            </w:tcMar>
+          </w:tcPr>
+          <w:p>
+            <w:pPr>
+              <w:spacing w:before="0" w:after="0" w:line="276" w:lineRule="auto"/>
+            </w:pPr>
+            <w:r>
+              <w:rPr>
+                <w:rFonts w:ascii="Calibri" w:hAnsi="Calibri"/>
+                <w:color w:val="222222"/>
+                <w:sz w:val="18"/>
+              </w:rPr>
+              <w:t>Total Estimated Initial CapEx</w:t>
+            </w:r>
+          </w:p>
+        </w:tc>
+        <w:tc>
+          <w:tcPr>
+            <w:tcW w:type="dxa" w:w="1872"/>
+            <w:shd w:fill="FFFFFF"/>
+            <w:tcMar>
+              <w:top w:w="60" w:type="dxa"/>
+              <w:bottom w:w="60" w:type="dxa"/>
+              <w:left w:w="100" w:type="dxa"/>
+              <w:right w:w="100" w:type="dxa"/>
+            </w:tcMar>
+          </w:tcPr>
+          <w:p>
+            <w:pPr>
+              <w:spacing w:before="0" w:after="0" w:line="276" w:lineRule="auto"/>
+            </w:pPr>
+            <w:r>
+              <w:rPr>
+                <w:rFonts w:ascii="Calibri" w:hAnsi="Calibri"/>
+                <w:color w:val="222222"/>
+                <w:sz w:val="18"/>
+              </w:rPr>
+              <w:t>485,000 BDT</w:t>
+            </w:r>
+          </w:p>
+        </w:tc>
+        <w:tc>
+          <w:tcPr>
+            <w:tcW w:type="dxa" w:w="5040"/>
+            <w:shd w:fill="FFFFFF"/>
+            <w:tcMar>
+              <w:top w:w="60" w:type="dxa"/>
+              <w:bottom w:w="60" w:type="dxa"/>
+              <w:left w:w="100" w:type="dxa"/>
+              <w:right w:w="100" w:type="dxa"/>
+            </w:tcMar>
+          </w:tcPr>
+          <w:p>
+            <w:pPr>
+              <w:spacing w:before="0" w:after="0" w:line="276" w:lineRule="auto"/>
+            </w:pPr>
+            <w:r>
+              <w:rPr>
+                <w:rFonts w:ascii="Calibri" w:hAnsi="Calibri"/>
+                <w:color w:val="222222"/>
+                <w:sz w:val="18"/>
+              </w:rPr>
+              <w:t>Total initial capitalization required for 14-week delivery and pilot deployment.</w:t>
+            </w:r>
+          </w:p>
+        </w:tc>
+      </w:tr>
+    </w:tbl>
+    <w:tbl>
+      <w:tblPr>
+        <w:tblW w:type="auto" w:w="0"/>
+        <w:jc w:val="center"/>
+        <w:tblLook w:firstColumn="1" w:firstRow="1" w:lastColumn="0" w:lastRow="0" w:noHBand="0" w:noVBand="1" w:val="04A0"/>
+      </w:tblPr>
+      <w:tblGrid>
+        <w:gridCol w:w="9792"/>
+      </w:tblGrid>
+      <w:tr>
+        <w:tc>
+          <w:tcPr>
+            <w:tcW w:type="dxa" w:w="9792"/>
+            <w:shd w:fill="F1F5F9"/>
+            <w:tcMar>
+              <w:top w:w="100" w:type="dxa"/>
+              <w:bottom w:w="100" w:type="dxa"/>
+              <w:left w:w="160" w:type="dxa"/>
+              <w:right w:w="140" w:type="dxa"/>
+            </w:tcMar>
+            <w:tcBorders>
+              <w:left w:val="single" w:sz="24" w:space="0" w:color="1B365D"/>
+              <w:top w:val="none"/>
+              <w:right w:val="none"/>
+              <w:bottom w:val="none"/>
+            </w:tcBorders>
+          </w:tcPr>
+          <w:p>
+            <w:pPr>
+              <w:spacing w:before="20" w:after="40" w:line="276" w:lineRule="auto"/>
+            </w:pPr>
+            <w:r>
+              <w:rPr>
+                <w:rFonts w:ascii="Calibri" w:hAnsi="Calibri"/>
+                <w:b/>
+                <w:color w:val="1B365D"/>
+                <w:sz w:val="20"/>
+              </w:rPr>
+              <w:t>EMPIRICAL RETURN ON INVESTMENT (ROI) &amp; 2.80-MONTH PAYBACK PERIOD</w:t>
+              <w:br/>
+            </w:r>
+          </w:p>
+          <w:p>
+            <w:pPr>
+              <w:spacing w:before="20" w:after="40" w:line="276" w:lineRule="auto"/>
+            </w:pPr>
+            <w:r>
+              <w:rPr>
+                <w:rFonts w:ascii="Calibri" w:hAnsi="Calibri"/>
+                <w:i/>
+                <w:color w:val="222222"/>
+                <w:sz w:val="19"/>
+              </w:rPr>
+              <w:t>Working Financial Payback Arithmetic: Payback Period = Total CapEx / (Monthly Gross Savings - Monthly OpEx)</w:t>
+            </w:r>
+          </w:p>
+          <w:p>
+            <w:pPr>
+              <w:spacing w:before="20" w:after="40" w:line="276" w:lineRule="auto"/>
+            </w:pPr>
+            <w:r>
+              <w:rPr>
+                <w:rFonts w:ascii="Calibri" w:hAnsi="Calibri"/>
+                <w:i/>
+                <w:color w:val="222222"/>
+                <w:sz w:val="19"/>
+              </w:rPr>
+              <w:t>= 485,000 BDT / (187,200 BDT - 14,000 BDT) = 485,000 / 173,200 ≈ 2.80 MONTHS (~84 Days)</w:t>
+            </w:r>
+          </w:p>
+          <w:p>
+            <w:pPr>
+              <w:spacing w:before="20" w:after="40" w:line="276" w:lineRule="auto"/>
+            </w:pPr>
+            <w:r>
+              <w:rPr>
+                <w:rFonts w:ascii="Calibri" w:hAnsi="Calibri"/>
+                <w:i/>
+                <w:color w:val="222222"/>
+                <w:sz w:val="19"/>
+              </w:rPr>
+              <w:t>• Spoilage Savings: 112,000 BDT/mo | Shrinkage Elimination: 45,200 BDT/mo | Stockout Recovery: 30,000 BDT/mo</w:t>
+            </w:r>
+          </w:p>
+          <w:p>
+            <w:pPr>
+              <w:spacing w:before="20" w:after="40" w:line="276" w:lineRule="auto"/>
+            </w:pPr>
+            <w:r>
+              <w:rPr>
+                <w:rFonts w:ascii="Calibri" w:hAnsi="Calibri"/>
+                <w:i/>
+                <w:color w:val="222222"/>
+                <w:sz w:val="19"/>
+              </w:rPr>
+              <w:t>• Monthly Operational Overhead (OpEx): 14,000 BDT/mo (VPS, label rolls, 4G data backup)</w:t>
+            </w:r>
+          </w:p>
+          <w:p>
+            <w:pPr>
+              <w:spacing w:before="20" w:after="40" w:line="276" w:lineRule="auto"/>
+            </w:pPr>
+            <w:r>
+              <w:rPr>
+                <w:rFonts w:ascii="Calibri" w:hAnsi="Calibri"/>
+                <w:i/>
+                <w:color w:val="222222"/>
+                <w:sz w:val="19"/>
+              </w:rPr>
+              <w:t>• Economic Feasibility Verdict: Full capital recoupment is achieved within under 3 months of live pilot operations.</w:t>
+            </w:r>
+          </w:p>
+        </w:tc>
+      </w:tr>
+    </w:tbl>
+    <w:p>
+      <w:pPr>
         <w:keepNext/>
         <w:spacing w:before="220" w:after="60"/>
       </w:pPr>
@@ -17223,7 +17960,7 @@
           <w:color w:val="222222"/>
           <w:sz w:val="20"/>
         </w:rPr>
-        <w:t>8. Ke, G. et al., 'LightGBM: A Highly Efficient Gradient Boosting Decision Tree,' Advances in Neural Information Processing Systems (NeurIPS), 2017.</w:t>
+        <w:t>8. Prokhorenkova, L. et al., 'CatBoost: unbiased boosting with categorical features,' Advances in Neural Information Processing Systems (NeurIPS 31), 2018.</w:t>
       </w:r>
     </w:p>
     <w:p>
@@ -17236,7 +17973,7 @@
           <w:color w:val="222222"/>
           <w:sz w:val="20"/>
         </w:rPr>
-        <w:t>9. Bangladesh Supermarket Owners Association (BSOA), 'Annual Report on Supermarket Operations, Wastage, and Modern Trade Dynamics in Bangladesh,' Dhaka, 2023.</w:t>
+        <w:t>9. Ke, G. et al., 'LightGBM: A Highly Efficient Gradient Boosting Decision Tree,' Advances in Neural Information Processing Systems (NeurIPS), 2017. (Deferred to v2.0 benchmark roadmap).</w:t>
       </w:r>
     </w:p>
     <w:p>
@@ -17249,7 +17986,20 @@
           <w:color w:val="222222"/>
           <w:sz w:val="20"/>
         </w:rPr>
-        <w:t>10. Food and Agriculture Organization of the United Nations (FAO), 'Food Loss and Waste in Retail Supply Chains in South Asia,' Rome, 2021.</w:t>
+        <w:t>10. Bangladesh Supermarket Owners Association (BSOA), 'Annual Report on Supermarket Operations, Wastage, and Modern Trade Dynamics in Bangladesh,' Dhaka, 2023.</w:t>
+      </w:r>
+    </w:p>
+    <w:p>
+      <w:pPr>
+        <w:spacing w:before="0" w:after="60" w:line="276" w:lineRule="auto"/>
+      </w:pPr>
+      <w:r>
+        <w:rPr>
+          <w:rFonts w:ascii="Calibri" w:hAnsi="Calibri"/>
+          <w:color w:val="222222"/>
+          <w:sz w:val="20"/>
+        </w:rPr>
+        <w:t>11. Food and Agriculture Organization of the United Nations (FAO), 'Food Loss and Waste in Retail Supply Chains in South Asia,' Rome, 2021.</w:t>
       </w:r>
     </w:p>
     <w:sectPr>

</xml_diff>